<commit_message>
renames new reference documentation, updates methods document and adds comments
</commit_message>
<xml_diff>
--- a/data-raw/metadata/methods.docx
+++ b/data-raw/metadata/methods.docx
@@ -1,6 +1,6 @@
 
 <file path=word/document.xml><?xml version="1.0" encoding="utf-8"?>
-<w:document xmlns:wpc="http://schemas.microsoft.com/office/word/2010/wordprocessingCanvas" xmlns:cx="http://schemas.microsoft.com/office/drawing/2014/chartex" xmlns:cx1="http://schemas.microsoft.com/office/drawing/2015/9/8/chartex" xmlns:cx2="http://schemas.microsoft.com/office/drawing/2015/10/21/chartex" xmlns:cx3="http://schemas.microsoft.com/office/drawing/2016/5/9/chartex" xmlns:cx4="http://schemas.microsoft.com/office/drawing/2016/5/10/chartex" xmlns:cx5="http://schemas.microsoft.com/office/drawing/2016/5/11/chartex" xmlns:cx6="http://schemas.microsoft.com/office/drawing/2016/5/12/chartex" xmlns:cx7="http://schemas.microsoft.com/office/drawing/2016/5/13/chartex" xmlns:cx8="http://schemas.microsoft.com/office/drawing/2016/5/14/chartex" xmlns:mc="http://schemas.openxmlformats.org/markup-compatibility/2006" xmlns:aink="http://schemas.microsoft.com/office/drawing/2016/ink" xmlns:am3d="http://schemas.microsoft.com/office/drawing/2017/model3d" xmlns:o="urn:schemas-microsoft-com:office:office" xmlns:oel="http://schemas.microsoft.com/office/2019/extlst" xmlns:r="http://schemas.openxmlformats.org/officeDocument/2006/relationships" xmlns:m="http://schemas.openxmlformats.org/officeDocument/2006/math" xmlns:v="urn:schemas-microsoft-com:vml" xmlns:wp14="http://schemas.microsoft.com/office/word/2010/wordprocessingDrawing" xmlns:wp="http://schemas.openxmlformats.org/drawingml/2006/wordprocessingDrawing" xmlns:w10="urn:schemas-microsoft-com:office:word" xmlns:w="http://schemas.openxmlformats.org/wordprocessingml/2006/main" xmlns:w14="http://schemas.microsoft.com/office/word/2010/wordml" xmlns:w15="http://schemas.microsoft.com/office/word/2012/wordml" xmlns:w16cex="http://schemas.microsoft.com/office/word/2018/wordml/cex" xmlns:w16cid="http://schemas.microsoft.com/office/word/2016/wordml/cid" xmlns:w16="http://schemas.microsoft.com/office/word/2018/wordml" xmlns:w16sdtdh="http://schemas.microsoft.com/office/word/2020/wordml/sdtdatahash" xmlns:w16se="http://schemas.microsoft.com/office/word/2015/wordml/symex" xmlns:wpg="http://schemas.microsoft.com/office/word/2010/wordprocessingGroup" xmlns:wpi="http://schemas.microsoft.com/office/word/2010/wordprocessingInk" xmlns:wne="http://schemas.microsoft.com/office/word/2006/wordml" xmlns:wps="http://schemas.microsoft.com/office/word/2010/wordprocessingShape" mc:Ignorable="w14 w15 w16se w16cid w16 w16cex w16sdtdh wp14">
+<w:document xmlns:wpc="http://schemas.microsoft.com/office/word/2010/wordprocessingCanvas" xmlns:cx="http://schemas.microsoft.com/office/drawing/2014/chartex" xmlns:cx1="http://schemas.microsoft.com/office/drawing/2015/9/8/chartex" xmlns:cx2="http://schemas.microsoft.com/office/drawing/2015/10/21/chartex" xmlns:cx3="http://schemas.microsoft.com/office/drawing/2016/5/9/chartex" xmlns:cx4="http://schemas.microsoft.com/office/drawing/2016/5/10/chartex" xmlns:cx5="http://schemas.microsoft.com/office/drawing/2016/5/11/chartex" xmlns:cx6="http://schemas.microsoft.com/office/drawing/2016/5/12/chartex" xmlns:cx7="http://schemas.microsoft.com/office/drawing/2016/5/13/chartex" xmlns:cx8="http://schemas.microsoft.com/office/drawing/2016/5/14/chartex" xmlns:mc="http://schemas.openxmlformats.org/markup-compatibility/2006" xmlns:aink="http://schemas.microsoft.com/office/drawing/2016/ink" xmlns:am3d="http://schemas.microsoft.com/office/drawing/2017/model3d" xmlns:o="urn:schemas-microsoft-com:office:office" xmlns:oel="http://schemas.microsoft.com/office/2019/extlst" xmlns:r="http://schemas.openxmlformats.org/officeDocument/2006/relationships" xmlns:m="http://schemas.openxmlformats.org/officeDocument/2006/math" xmlns:v="urn:schemas-microsoft-com:vml" xmlns:wp14="http://schemas.microsoft.com/office/word/2010/wordprocessingDrawing" xmlns:wp="http://schemas.openxmlformats.org/drawingml/2006/wordprocessingDrawing" xmlns:w10="urn:schemas-microsoft-com:office:word" xmlns:w="http://schemas.openxmlformats.org/wordprocessingml/2006/main" xmlns:w14="http://schemas.microsoft.com/office/word/2010/wordml" xmlns:w15="http://schemas.microsoft.com/office/word/2012/wordml" xmlns:w16cex="http://schemas.microsoft.com/office/word/2018/wordml/cex" xmlns:w16cid="http://schemas.microsoft.com/office/word/2016/wordml/cid" xmlns:w16="http://schemas.microsoft.com/office/word/2018/wordml" xmlns:w16du="http://schemas.microsoft.com/office/word/2023/wordml/word16du" xmlns:w16sdtdh="http://schemas.microsoft.com/office/word/2020/wordml/sdtdatahash" xmlns:w16sdtfl="http://schemas.microsoft.com/office/word/2024/wordml/sdtformatlock" xmlns:w16se="http://schemas.microsoft.com/office/word/2015/wordml/symex" xmlns:wpg="http://schemas.microsoft.com/office/word/2010/wordprocessingGroup" xmlns:wpi="http://schemas.microsoft.com/office/word/2010/wordprocessingInk" xmlns:wne="http://schemas.microsoft.com/office/word/2006/wordml" xmlns:wps="http://schemas.microsoft.com/office/word/2010/wordprocessingShape" mc:Ignorable="w14 w15 w16se w16cid w16 w16cex w16sdtdh w16sdtfl w16du wp14">
   <w:body>
     <w:p>
       <w:pPr>
@@ -168,27 +168,7 @@
           <w:sz w:val="24"/>
           <w:szCs w:val="24"/>
         </w:rPr>
-        <w:t xml:space="preserve"> VAKI </w:t>
-      </w:r>
-      <w:proofErr w:type="spellStart"/>
-      <w:r>
-        <w:rPr>
-          <w:rFonts w:ascii="Aptos" w:eastAsia="Times New Roman" w:hAnsi="Aptos" w:cs="Arial"/>
-          <w:color w:val="000000"/>
-          <w:sz w:val="24"/>
-          <w:szCs w:val="24"/>
-        </w:rPr>
-        <w:t>Riverwatcher</w:t>
-      </w:r>
-      <w:proofErr w:type="spellEnd"/>
-      <w:r>
-        <w:rPr>
-          <w:rFonts w:ascii="Aptos" w:eastAsia="Times New Roman" w:hAnsi="Aptos" w:cs="Arial"/>
-          <w:color w:val="000000"/>
-          <w:sz w:val="24"/>
-          <w:szCs w:val="24"/>
-        </w:rPr>
-        <w:t>™</w:t>
+        <w:t xml:space="preserve"> VAKI Riverwatcher™</w:t>
       </w:r>
       <w:r>
         <w:rPr>
@@ -287,7 +267,17 @@
           <w:sz w:val="24"/>
           <w:szCs w:val="24"/>
         </w:rPr>
-        <w:t xml:space="preserve"> 202</w:t>
+        <w:t xml:space="preserve"> </w:t>
+      </w:r>
+      <w:commentRangeStart w:id="0"/>
+      <w:r>
+        <w:rPr>
+          <w:rFonts w:ascii="Aptos" w:eastAsia="Times New Roman" w:hAnsi="Aptos" w:cs="Arial"/>
+          <w:color w:val="000000"/>
+          <w:sz w:val="24"/>
+          <w:szCs w:val="24"/>
+        </w:rPr>
+        <w:t>202</w:t>
       </w:r>
       <w:r>
         <w:rPr>
@@ -297,6 +287,17 @@
           <w:szCs w:val="24"/>
         </w:rPr>
         <w:t>3</w:t>
+      </w:r>
+      <w:commentRangeEnd w:id="0"/>
+      <w:r>
+        <w:rPr>
+          <w:rStyle w:val="CommentReference"/>
+          <w:rFonts w:ascii="Aptos" w:eastAsia="Times New Roman" w:hAnsi="Aptos" w:cs="Arial"/>
+          <w:color w:val="000000"/>
+          <w:sz w:val="24"/>
+          <w:szCs w:val="24"/>
+        </w:rPr>
+        <w:commentReference w:id="0"/>
       </w:r>
       <w:r>
         <w:rPr>
@@ -470,27 +471,7 @@
           <w:sz w:val="24"/>
           <w:szCs w:val="24"/>
         </w:rPr>
-        <w:t xml:space="preserve">s presented in </w:t>
-      </w:r>
-      <w:proofErr w:type="spellStart"/>
-      <w:r>
-        <w:rPr>
-          <w:rFonts w:ascii="Aptos" w:eastAsia="Times New Roman" w:hAnsi="Aptos" w:cs="Arial"/>
-          <w:color w:val="000000"/>
-          <w:sz w:val="24"/>
-          <w:szCs w:val="24"/>
-        </w:rPr>
-        <w:t>Poxon</w:t>
-      </w:r>
-      <w:proofErr w:type="spellEnd"/>
-      <w:r>
-        <w:rPr>
-          <w:rFonts w:ascii="Aptos" w:eastAsia="Times New Roman" w:hAnsi="Aptos" w:cs="Arial"/>
-          <w:color w:val="000000"/>
-          <w:sz w:val="24"/>
-          <w:szCs w:val="24"/>
-        </w:rPr>
-        <w:t xml:space="preserve"> &amp; Bratovich (2020).</w:t>
+        <w:t>s presented in Poxon &amp; Bratovich (2020).</w:t>
       </w:r>
       <w:r>
         <w:rPr>
@@ -777,27 +758,7 @@
           <w:sz w:val="24"/>
           <w:szCs w:val="24"/>
         </w:rPr>
-        <w:t xml:space="preserve"> as outlined in </w:t>
-      </w:r>
-      <w:proofErr w:type="spellStart"/>
-      <w:r>
-        <w:rPr>
-          <w:rFonts w:ascii="Aptos" w:eastAsia="Times New Roman" w:hAnsi="Aptos" w:cs="Arial"/>
-          <w:color w:val="000000"/>
-          <w:sz w:val="24"/>
-          <w:szCs w:val="24"/>
-        </w:rPr>
-        <w:t>Poxon</w:t>
-      </w:r>
-      <w:proofErr w:type="spellEnd"/>
-      <w:r>
-        <w:rPr>
-          <w:rFonts w:ascii="Aptos" w:eastAsia="Times New Roman" w:hAnsi="Aptos" w:cs="Arial"/>
-          <w:color w:val="000000"/>
-          <w:sz w:val="24"/>
-          <w:szCs w:val="24"/>
-        </w:rPr>
-        <w:t xml:space="preserve"> and Bratovich (2020). </w:t>
+        <w:t xml:space="preserve"> as outlined in Poxon and Bratovich (2020). </w:t>
       </w:r>
     </w:p>
     <w:p>
@@ -905,7 +866,100 @@
           <w:sz w:val="24"/>
           <w:szCs w:val="24"/>
         </w:rPr>
-        <w:t>by Table 1 in Poxon and Bratovich (2023). Table 1 in Poxon and Bratovich (2023) is also expanded to include results of count correction and run differentiation analyses for biological years 2020 through 2022.</w:t>
+        <w:t>by Table 1 in Poxon and Bratovich (202</w:t>
+      </w:r>
+      <w:del w:id="1" w:author="Badhia Katz" w:date="2026-02-23T11:42:00Z" w16du:dateUtc="2026-02-23T19:42:00Z">
+        <w:r>
+          <w:rPr>
+            <w:rFonts w:ascii="Aptos" w:eastAsia="Times New Roman" w:hAnsi="Aptos" w:cs="Arial"/>
+            <w:color w:val="000000"/>
+            <w:sz w:val="24"/>
+            <w:szCs w:val="24"/>
+          </w:rPr>
+          <w:delText>3</w:delText>
+        </w:r>
+      </w:del>
+      <w:ins w:id="2" w:author="Badhia Katz" w:date="2026-02-23T11:42:00Z" w16du:dateUtc="2026-02-23T19:42:00Z">
+        <w:r>
+          <w:rPr>
+            <w:rFonts w:ascii="Aptos" w:eastAsia="Times New Roman" w:hAnsi="Aptos" w:cs="Arial"/>
+            <w:color w:val="000000"/>
+            <w:sz w:val="24"/>
+            <w:szCs w:val="24"/>
+          </w:rPr>
+          <w:t>4</w:t>
+        </w:r>
+      </w:ins>
+      <w:r>
+        <w:rPr>
+          <w:rFonts w:ascii="Aptos" w:eastAsia="Times New Roman" w:hAnsi="Aptos" w:cs="Arial"/>
+          <w:color w:val="000000"/>
+          <w:sz w:val="24"/>
+          <w:szCs w:val="24"/>
+        </w:rPr>
+        <w:t>). Table 1 in Poxon and Bratovich (202</w:t>
+      </w:r>
+      <w:ins w:id="3" w:author="Badhia Katz" w:date="2026-02-23T11:42:00Z" w16du:dateUtc="2026-02-23T19:42:00Z">
+        <w:r>
+          <w:rPr>
+            <w:rFonts w:ascii="Aptos" w:eastAsia="Times New Roman" w:hAnsi="Aptos" w:cs="Arial"/>
+            <w:color w:val="000000"/>
+            <w:sz w:val="24"/>
+            <w:szCs w:val="24"/>
+          </w:rPr>
+          <w:t>4</w:t>
+        </w:r>
+      </w:ins>
+      <w:del w:id="4" w:author="Badhia Katz" w:date="2026-02-23T11:42:00Z" w16du:dateUtc="2026-02-23T19:42:00Z">
+        <w:r>
+          <w:rPr>
+            <w:rFonts w:ascii="Aptos" w:eastAsia="Times New Roman" w:hAnsi="Aptos" w:cs="Arial"/>
+            <w:color w:val="000000"/>
+            <w:sz w:val="24"/>
+            <w:szCs w:val="24"/>
+          </w:rPr>
+          <w:delText>3</w:delText>
+        </w:r>
+      </w:del>
+      <w:r>
+        <w:rPr>
+          <w:rFonts w:ascii="Aptos" w:eastAsia="Times New Roman" w:hAnsi="Aptos" w:cs="Arial"/>
+          <w:color w:val="000000"/>
+          <w:sz w:val="24"/>
+          <w:szCs w:val="24"/>
+        </w:rPr>
+        <w:t>) is also expanded to include results of count correction and run differentiation analyses for biological years 2020 through 202</w:t>
+      </w:r>
+      <w:ins w:id="5" w:author="Badhia Katz" w:date="2026-02-23T11:42:00Z" w16du:dateUtc="2026-02-23T19:42:00Z">
+        <w:r>
+          <w:rPr>
+            <w:rFonts w:ascii="Aptos" w:eastAsia="Times New Roman" w:hAnsi="Aptos" w:cs="Arial"/>
+            <w:color w:val="000000"/>
+            <w:sz w:val="24"/>
+            <w:szCs w:val="24"/>
+          </w:rPr>
+          <w:t>4</w:t>
+        </w:r>
+      </w:ins>
+      <w:del w:id="6" w:author="Badhia Katz" w:date="2026-02-23T11:42:00Z" w16du:dateUtc="2026-02-23T19:42:00Z">
+        <w:r>
+          <w:rPr>
+            <w:rFonts w:ascii="Aptos" w:eastAsia="Times New Roman" w:hAnsi="Aptos" w:cs="Arial"/>
+            <w:color w:val="000000"/>
+            <w:sz w:val="24"/>
+            <w:szCs w:val="24"/>
+          </w:rPr>
+          <w:delText>2</w:delText>
+        </w:r>
+      </w:del>
+      <w:r>
+        <w:rPr>
+          <w:rFonts w:ascii="Aptos" w:eastAsia="Times New Roman" w:hAnsi="Aptos" w:cs="Arial"/>
+          <w:color w:val="000000"/>
+          <w:sz w:val="24"/>
+          <w:szCs w:val="24"/>
+        </w:rPr>
+        <w:t>.</w:t>
       </w:r>
       <w:r>
         <w:rPr>
@@ -981,7 +1035,6 @@
         </w:rPr>
         <w:t xml:space="preserve"> </w:t>
       </w:r>
-      <w:proofErr w:type="spellStart"/>
       <w:r>
         <w:rPr>
           <w:rFonts w:ascii="Aptos" w:eastAsia="Times New Roman" w:hAnsi="Aptos" w:cs="Arial"/>
@@ -990,7 +1043,6 @@
         </w:rPr>
         <w:t>Riverwatcher</w:t>
       </w:r>
-      <w:proofErr w:type="spellEnd"/>
       <w:r>
         <w:rPr>
           <w:rFonts w:ascii="Aptos" w:eastAsia="Times New Roman" w:hAnsi="Aptos" w:cs="Arial"/>
@@ -1049,7 +1101,35 @@
           <w:sz w:val="24"/>
           <w:szCs w:val="24"/>
         </w:rPr>
-        <w:t>Poxon, B. and Bratovich, P. 2023. Summary Table</w:t>
+        <w:t>Poxon, B. and Bratovich, P. 202</w:t>
+      </w:r>
+      <w:del w:id="7" w:author="Badhia Katz" w:date="2026-02-23T11:41:00Z" w16du:dateUtc="2026-02-23T19:41:00Z">
+        <w:r>
+          <w:rPr>
+            <w:rFonts w:ascii="Aptos" w:eastAsia="Times New Roman" w:hAnsi="Aptos" w:cs="Arial"/>
+            <w:sz w:val="24"/>
+            <w:szCs w:val="24"/>
+          </w:rPr>
+          <w:delText>3</w:delText>
+        </w:r>
+      </w:del>
+      <w:ins w:id="8" w:author="Badhia Katz" w:date="2026-02-23T11:41:00Z" w16du:dateUtc="2026-02-23T19:41:00Z">
+        <w:r>
+          <w:rPr>
+            <w:rFonts w:ascii="Aptos" w:eastAsia="Times New Roman" w:hAnsi="Aptos" w:cs="Arial"/>
+            <w:sz w:val="24"/>
+            <w:szCs w:val="24"/>
+          </w:rPr>
+          <w:t>4</w:t>
+        </w:r>
+      </w:ins>
+      <w:r>
+        <w:rPr>
+          <w:rFonts w:ascii="Aptos" w:eastAsia="Times New Roman" w:hAnsi="Aptos" w:cs="Arial"/>
+          <w:sz w:val="24"/>
+          <w:szCs w:val="24"/>
+        </w:rPr>
+        <w:t>. Summary Table</w:t>
       </w:r>
       <w:r>
         <w:rPr>
@@ -1073,7 +1153,35 @@
           <w:sz w:val="24"/>
           <w:szCs w:val="24"/>
         </w:rPr>
-        <w:t>™ Chinook Salmon Passage and Run Differentiation Analyses for Biological Years 2004-2022. Prepared by HDR for Yuba Water Agency.</w:t>
+        <w:t>™ Chinook Salmon Passage and Run Differentiation Analyses for Biological Years 2004-202</w:t>
+      </w:r>
+      <w:ins w:id="9" w:author="Badhia Katz" w:date="2026-02-23T11:41:00Z" w16du:dateUtc="2026-02-23T19:41:00Z">
+        <w:r>
+          <w:rPr>
+            <w:rFonts w:ascii="Aptos" w:eastAsia="Times New Roman" w:hAnsi="Aptos" w:cs="Arial"/>
+            <w:sz w:val="24"/>
+            <w:szCs w:val="24"/>
+          </w:rPr>
+          <w:t>4</w:t>
+        </w:r>
+      </w:ins>
+      <w:del w:id="10" w:author="Badhia Katz" w:date="2026-02-23T11:41:00Z" w16du:dateUtc="2026-02-23T19:41:00Z">
+        <w:r>
+          <w:rPr>
+            <w:rFonts w:ascii="Aptos" w:eastAsia="Times New Roman" w:hAnsi="Aptos" w:cs="Arial"/>
+            <w:sz w:val="24"/>
+            <w:szCs w:val="24"/>
+          </w:rPr>
+          <w:delText>2</w:delText>
+        </w:r>
+      </w:del>
+      <w:r>
+        <w:rPr>
+          <w:rFonts w:ascii="Aptos" w:eastAsia="Times New Roman" w:hAnsi="Aptos" w:cs="Arial"/>
+          <w:sz w:val="24"/>
+          <w:szCs w:val="24"/>
+        </w:rPr>
+        <w:t>. Prepared by HDR for Yuba Water Agency.</w:t>
       </w:r>
     </w:p>
     <w:sectPr>
@@ -1086,8 +1194,47 @@
 </w:document>
 </file>
 
+<file path=word/comments.xml><?xml version="1.0" encoding="utf-8"?>
+<w:comments xmlns:wpc="http://schemas.microsoft.com/office/word/2010/wordprocessingCanvas" xmlns:cx="http://schemas.microsoft.com/office/drawing/2014/chartex" xmlns:cx1="http://schemas.microsoft.com/office/drawing/2015/9/8/chartex" xmlns:cx2="http://schemas.microsoft.com/office/drawing/2015/10/21/chartex" xmlns:cx3="http://schemas.microsoft.com/office/drawing/2016/5/9/chartex" xmlns:cx4="http://schemas.microsoft.com/office/drawing/2016/5/10/chartex" xmlns:cx5="http://schemas.microsoft.com/office/drawing/2016/5/11/chartex" xmlns:cx6="http://schemas.microsoft.com/office/drawing/2016/5/12/chartex" xmlns:cx7="http://schemas.microsoft.com/office/drawing/2016/5/13/chartex" xmlns:cx8="http://schemas.microsoft.com/office/drawing/2016/5/14/chartex" xmlns:mc="http://schemas.openxmlformats.org/markup-compatibility/2006" xmlns:aink="http://schemas.microsoft.com/office/drawing/2016/ink" xmlns:am3d="http://schemas.microsoft.com/office/drawing/2017/model3d" xmlns:o="urn:schemas-microsoft-com:office:office" xmlns:oel="http://schemas.microsoft.com/office/2019/extlst" xmlns:r="http://schemas.openxmlformats.org/officeDocument/2006/relationships" xmlns:m="http://schemas.openxmlformats.org/officeDocument/2006/math" xmlns:v="urn:schemas-microsoft-com:vml" xmlns:wp14="http://schemas.microsoft.com/office/word/2010/wordprocessingDrawing" xmlns:wp="http://schemas.openxmlformats.org/drawingml/2006/wordprocessingDrawing" xmlns:w10="urn:schemas-microsoft-com:office:word" xmlns:w="http://schemas.openxmlformats.org/wordprocessingml/2006/main" xmlns:w14="http://schemas.microsoft.com/office/word/2010/wordml" xmlns:w15="http://schemas.microsoft.com/office/word/2012/wordml" xmlns:w16cex="http://schemas.microsoft.com/office/word/2018/wordml/cex" xmlns:w16cid="http://schemas.microsoft.com/office/word/2016/wordml/cid" xmlns:w16="http://schemas.microsoft.com/office/word/2018/wordml" xmlns:w16du="http://schemas.microsoft.com/office/word/2023/wordml/word16du" xmlns:w16sdtdh="http://schemas.microsoft.com/office/word/2020/wordml/sdtdatahash" xmlns:w16sdtfl="http://schemas.microsoft.com/office/word/2024/wordml/sdtformatlock" xmlns:w16se="http://schemas.microsoft.com/office/word/2015/wordml/symex" xmlns:wpg="http://schemas.microsoft.com/office/word/2010/wordprocessingGroup" xmlns:wpi="http://schemas.microsoft.com/office/word/2010/wordprocessingInk" xmlns:wne="http://schemas.microsoft.com/office/word/2006/wordml" xmlns:wps="http://schemas.microsoft.com/office/word/2010/wordprocessingShape" mc:Ignorable="w14 w15 w16se w16cid w16 w16cex w16sdtdh w16sdtfl w16du wp14">
+  <w:comment w:id="0" w:author="Badhia Katz" w:date="2026-02-23T11:45:00Z" w:initials="BK">
+    <w:p>
+      <w:pPr>
+        <w:pStyle w:val="CommentText"/>
+      </w:pPr>
+      <w:r>
+        <w:rPr>
+          <w:rStyle w:val="CommentReference"/>
+        </w:rPr>
+        <w:annotationRef/>
+      </w:r>
+      <w:r>
+        <w:t>Have later years been modeled?</w:t>
+      </w:r>
+    </w:p>
+  </w:comment>
+</w:comments>
+</file>
+
+<file path=word/commentsExtended.xml><?xml version="1.0" encoding="utf-8"?>
+<w15:commentsEx xmlns:wpc="http://schemas.microsoft.com/office/word/2010/wordprocessingCanvas" xmlns:cx="http://schemas.microsoft.com/office/drawing/2014/chartex" xmlns:cx1="http://schemas.microsoft.com/office/drawing/2015/9/8/chartex" xmlns:cx2="http://schemas.microsoft.com/office/drawing/2015/10/21/chartex" xmlns:cx3="http://schemas.microsoft.com/office/drawing/2016/5/9/chartex" xmlns:cx4="http://schemas.microsoft.com/office/drawing/2016/5/10/chartex" xmlns:cx5="http://schemas.microsoft.com/office/drawing/2016/5/11/chartex" xmlns:cx6="http://schemas.microsoft.com/office/drawing/2016/5/12/chartex" xmlns:cx7="http://schemas.microsoft.com/office/drawing/2016/5/13/chartex" xmlns:cx8="http://schemas.microsoft.com/office/drawing/2016/5/14/chartex" xmlns:mc="http://schemas.openxmlformats.org/markup-compatibility/2006" xmlns:aink="http://schemas.microsoft.com/office/drawing/2016/ink" xmlns:am3d="http://schemas.microsoft.com/office/drawing/2017/model3d" xmlns:o="urn:schemas-microsoft-com:office:office" xmlns:oel="http://schemas.microsoft.com/office/2019/extlst" xmlns:r="http://schemas.openxmlformats.org/officeDocument/2006/relationships" xmlns:m="http://schemas.openxmlformats.org/officeDocument/2006/math" xmlns:v="urn:schemas-microsoft-com:vml" xmlns:wp14="http://schemas.microsoft.com/office/word/2010/wordprocessingDrawing" xmlns:wp="http://schemas.openxmlformats.org/drawingml/2006/wordprocessingDrawing" xmlns:w10="urn:schemas-microsoft-com:office:word" xmlns:w="http://schemas.openxmlformats.org/wordprocessingml/2006/main" xmlns:w14="http://schemas.microsoft.com/office/word/2010/wordml" xmlns:w15="http://schemas.microsoft.com/office/word/2012/wordml" xmlns:w16cex="http://schemas.microsoft.com/office/word/2018/wordml/cex" xmlns:w16cid="http://schemas.microsoft.com/office/word/2016/wordml/cid" xmlns:w16="http://schemas.microsoft.com/office/word/2018/wordml" xmlns:w16du="http://schemas.microsoft.com/office/word/2023/wordml/word16du" xmlns:w16sdtdh="http://schemas.microsoft.com/office/word/2020/wordml/sdtdatahash" xmlns:w16sdtfl="http://schemas.microsoft.com/office/word/2024/wordml/sdtformatlock" xmlns:w16se="http://schemas.microsoft.com/office/word/2015/wordml/symex" xmlns:wpg="http://schemas.microsoft.com/office/word/2010/wordprocessingGroup" xmlns:wpi="http://schemas.microsoft.com/office/word/2010/wordprocessingInk" xmlns:wne="http://schemas.microsoft.com/office/word/2006/wordml" xmlns:wps="http://schemas.microsoft.com/office/word/2010/wordprocessingShape" mc:Ignorable="w14 w15 w16se w16cid w16 w16cex w16sdtdh w16sdtfl w16du wp14">
+  <w15:commentEx w15:paraId="62ABDDB1" w15:done="0"/>
+</w15:commentsEx>
+</file>
+
+<file path=word/commentsExtensible.xml><?xml version="1.0" encoding="utf-8"?>
+<w16cex:commentsExtensible xmlns:wpc="http://schemas.microsoft.com/office/word/2010/wordprocessingCanvas" xmlns:cx="http://schemas.microsoft.com/office/drawing/2014/chartex" xmlns:cx1="http://schemas.microsoft.com/office/drawing/2015/9/8/chartex" xmlns:cx2="http://schemas.microsoft.com/office/drawing/2015/10/21/chartex" xmlns:cx3="http://schemas.microsoft.com/office/drawing/2016/5/9/chartex" xmlns:cx4="http://schemas.microsoft.com/office/drawing/2016/5/10/chartex" xmlns:cx5="http://schemas.microsoft.com/office/drawing/2016/5/11/chartex" xmlns:cx6="http://schemas.microsoft.com/office/drawing/2016/5/12/chartex" xmlns:cx7="http://schemas.microsoft.com/office/drawing/2016/5/13/chartex" xmlns:cx8="http://schemas.microsoft.com/office/drawing/2016/5/14/chartex" xmlns:cr="http://schemas.microsoft.com/office/comments/2020/reactions" xmlns:mc="http://schemas.openxmlformats.org/markup-compatibility/2006" xmlns:aink="http://schemas.microsoft.com/office/drawing/2016/ink" xmlns:am3d="http://schemas.microsoft.com/office/drawing/2017/model3d" xmlns:o="urn:schemas-microsoft-com:office:office" xmlns:oel="http://schemas.microsoft.com/office/2019/extlst" xmlns:r="http://schemas.openxmlformats.org/officeDocument/2006/relationships" xmlns:m="http://schemas.openxmlformats.org/officeDocument/2006/math" xmlns:v="urn:schemas-microsoft-com:vml" xmlns:wp14="http://schemas.microsoft.com/office/word/2010/wordprocessingDrawing" xmlns:wp="http://schemas.openxmlformats.org/drawingml/2006/wordprocessingDrawing" xmlns:w10="urn:schemas-microsoft-com:office:word" xmlns:w="http://schemas.openxmlformats.org/wordprocessingml/2006/main" xmlns:w14="http://schemas.microsoft.com/office/word/2010/wordml" xmlns:w15="http://schemas.microsoft.com/office/word/2012/wordml" xmlns:w16cex="http://schemas.microsoft.com/office/word/2018/wordml/cex" xmlns:w16cid="http://schemas.microsoft.com/office/word/2016/wordml/cid" xmlns:w16="http://schemas.microsoft.com/office/word/2018/wordml" xmlns:w16du="http://schemas.microsoft.com/office/word/2023/wordml/word16du" xmlns:w16sdtdh="http://schemas.microsoft.com/office/word/2020/wordml/sdtdatahash" xmlns:w16sdtfl="http://schemas.microsoft.com/office/word/2024/wordml/sdtformatlock" xmlns:w16se="http://schemas.microsoft.com/office/word/2015/wordml/symex" xmlns:wpg="http://schemas.microsoft.com/office/word/2010/wordprocessingGroup" xmlns:wpi="http://schemas.microsoft.com/office/word/2010/wordprocessingInk" xmlns:wne="http://schemas.microsoft.com/office/word/2006/wordml" xmlns:wps="http://schemas.microsoft.com/office/word/2010/wordprocessingShape" mc:Ignorable="w14 w15 w16se w16cid w16 w16cex w16sdtdh w16sdtfl cr w16du wp14">
+  <w16cex:commentExtensible w16cex:durableId="5BCB5155" w16cex:dateUtc="2026-02-23T19:45:00Z"/>
+</w16cex:commentsExtensible>
+</file>
+
+<file path=word/commentsIds.xml><?xml version="1.0" encoding="utf-8"?>
+<w16cid:commentsIds xmlns:wpc="http://schemas.microsoft.com/office/word/2010/wordprocessingCanvas" xmlns:cx="http://schemas.microsoft.com/office/drawing/2014/chartex" xmlns:cx1="http://schemas.microsoft.com/office/drawing/2015/9/8/chartex" xmlns:cx2="http://schemas.microsoft.com/office/drawing/2015/10/21/chartex" xmlns:cx3="http://schemas.microsoft.com/office/drawing/2016/5/9/chartex" xmlns:cx4="http://schemas.microsoft.com/office/drawing/2016/5/10/chartex" xmlns:cx5="http://schemas.microsoft.com/office/drawing/2016/5/11/chartex" xmlns:cx6="http://schemas.microsoft.com/office/drawing/2016/5/12/chartex" xmlns:cx7="http://schemas.microsoft.com/office/drawing/2016/5/13/chartex" xmlns:cx8="http://schemas.microsoft.com/office/drawing/2016/5/14/chartex" xmlns:mc="http://schemas.openxmlformats.org/markup-compatibility/2006" xmlns:aink="http://schemas.microsoft.com/office/drawing/2016/ink" xmlns:am3d="http://schemas.microsoft.com/office/drawing/2017/model3d" xmlns:o="urn:schemas-microsoft-com:office:office" xmlns:oel="http://schemas.microsoft.com/office/2019/extlst" xmlns:r="http://schemas.openxmlformats.org/officeDocument/2006/relationships" xmlns:m="http://schemas.openxmlformats.org/officeDocument/2006/math" xmlns:v="urn:schemas-microsoft-com:vml" xmlns:wp14="http://schemas.microsoft.com/office/word/2010/wordprocessingDrawing" xmlns:wp="http://schemas.openxmlformats.org/drawingml/2006/wordprocessingDrawing" xmlns:w10="urn:schemas-microsoft-com:office:word" xmlns:w="http://schemas.openxmlformats.org/wordprocessingml/2006/main" xmlns:w14="http://schemas.microsoft.com/office/word/2010/wordml" xmlns:w15="http://schemas.microsoft.com/office/word/2012/wordml" xmlns:w16cex="http://schemas.microsoft.com/office/word/2018/wordml/cex" xmlns:w16cid="http://schemas.microsoft.com/office/word/2016/wordml/cid" xmlns:w16="http://schemas.microsoft.com/office/word/2018/wordml" xmlns:w16du="http://schemas.microsoft.com/office/word/2023/wordml/word16du" xmlns:w16sdtdh="http://schemas.microsoft.com/office/word/2020/wordml/sdtdatahash" xmlns:w16sdtfl="http://schemas.microsoft.com/office/word/2024/wordml/sdtformatlock" xmlns:w16se="http://schemas.microsoft.com/office/word/2015/wordml/symex" xmlns:wpg="http://schemas.microsoft.com/office/word/2010/wordprocessingGroup" xmlns:wpi="http://schemas.microsoft.com/office/word/2010/wordprocessingInk" xmlns:wne="http://schemas.microsoft.com/office/word/2006/wordml" xmlns:wps="http://schemas.microsoft.com/office/word/2010/wordprocessingShape" mc:Ignorable="w14 w15 w16se w16cid w16 w16cex w16sdtdh w16sdtfl w16du wp14">
+  <w16cid:commentId w16cid:paraId="62ABDDB1" w16cid:durableId="5BCB5155"/>
+</w16cid:commentsIds>
+</file>
+
 <file path=word/numbering.xml><?xml version="1.0" encoding="utf-8"?>
-<w:numbering xmlns:wpc="http://schemas.microsoft.com/office/word/2010/wordprocessingCanvas" xmlns:cx="http://schemas.microsoft.com/office/drawing/2014/chartex" xmlns:cx1="http://schemas.microsoft.com/office/drawing/2015/9/8/chartex" xmlns:cx2="http://schemas.microsoft.com/office/drawing/2015/10/21/chartex" xmlns:cx3="http://schemas.microsoft.com/office/drawing/2016/5/9/chartex" xmlns:cx4="http://schemas.microsoft.com/office/drawing/2016/5/10/chartex" xmlns:cx5="http://schemas.microsoft.com/office/drawing/2016/5/11/chartex" xmlns:cx6="http://schemas.microsoft.com/office/drawing/2016/5/12/chartex" xmlns:cx7="http://schemas.microsoft.com/office/drawing/2016/5/13/chartex" xmlns:cx8="http://schemas.microsoft.com/office/drawing/2016/5/14/chartex" xmlns:mc="http://schemas.openxmlformats.org/markup-compatibility/2006" xmlns:aink="http://schemas.microsoft.com/office/drawing/2016/ink" xmlns:am3d="http://schemas.microsoft.com/office/drawing/2017/model3d" xmlns:o="urn:schemas-microsoft-com:office:office" xmlns:oel="http://schemas.microsoft.com/office/2019/extlst" xmlns:r="http://schemas.openxmlformats.org/officeDocument/2006/relationships" xmlns:m="http://schemas.openxmlformats.org/officeDocument/2006/math" xmlns:v="urn:schemas-microsoft-com:vml" xmlns:wp14="http://schemas.microsoft.com/office/word/2010/wordprocessingDrawing" xmlns:wp="http://schemas.openxmlformats.org/drawingml/2006/wordprocessingDrawing" xmlns:w10="urn:schemas-microsoft-com:office:word" xmlns:w="http://schemas.openxmlformats.org/wordprocessingml/2006/main" xmlns:w14="http://schemas.microsoft.com/office/word/2010/wordml" xmlns:w15="http://schemas.microsoft.com/office/word/2012/wordml" xmlns:w16cex="http://schemas.microsoft.com/office/word/2018/wordml/cex" xmlns:w16cid="http://schemas.microsoft.com/office/word/2016/wordml/cid" xmlns:w16="http://schemas.microsoft.com/office/word/2018/wordml" xmlns:w16sdtdh="http://schemas.microsoft.com/office/word/2020/wordml/sdtdatahash" xmlns:w16se="http://schemas.microsoft.com/office/word/2015/wordml/symex" xmlns:wpg="http://schemas.microsoft.com/office/word/2010/wordprocessingGroup" xmlns:wpi="http://schemas.microsoft.com/office/word/2010/wordprocessingInk" xmlns:wne="http://schemas.microsoft.com/office/word/2006/wordml" xmlns:wps="http://schemas.microsoft.com/office/word/2010/wordprocessingShape" mc:Ignorable="w14 w15 w16se w16cid w16 w16cex w16sdtdh wp14">
+<w:numbering xmlns:wpc="http://schemas.microsoft.com/office/word/2010/wordprocessingCanvas" xmlns:cx="http://schemas.microsoft.com/office/drawing/2014/chartex" xmlns:cx1="http://schemas.microsoft.com/office/drawing/2015/9/8/chartex" xmlns:cx2="http://schemas.microsoft.com/office/drawing/2015/10/21/chartex" xmlns:cx3="http://schemas.microsoft.com/office/drawing/2016/5/9/chartex" xmlns:cx4="http://schemas.microsoft.com/office/drawing/2016/5/10/chartex" xmlns:cx5="http://schemas.microsoft.com/office/drawing/2016/5/11/chartex" xmlns:cx6="http://schemas.microsoft.com/office/drawing/2016/5/12/chartex" xmlns:cx7="http://schemas.microsoft.com/office/drawing/2016/5/13/chartex" xmlns:cx8="http://schemas.microsoft.com/office/drawing/2016/5/14/chartex" xmlns:mc="http://schemas.openxmlformats.org/markup-compatibility/2006" xmlns:aink="http://schemas.microsoft.com/office/drawing/2016/ink" xmlns:am3d="http://schemas.microsoft.com/office/drawing/2017/model3d" xmlns:o="urn:schemas-microsoft-com:office:office" xmlns:oel="http://schemas.microsoft.com/office/2019/extlst" xmlns:r="http://schemas.openxmlformats.org/officeDocument/2006/relationships" xmlns:m="http://schemas.openxmlformats.org/officeDocument/2006/math" xmlns:v="urn:schemas-microsoft-com:vml" xmlns:wp14="http://schemas.microsoft.com/office/word/2010/wordprocessingDrawing" xmlns:wp="http://schemas.openxmlformats.org/drawingml/2006/wordprocessingDrawing" xmlns:w10="urn:schemas-microsoft-com:office:word" xmlns:w="http://schemas.openxmlformats.org/wordprocessingml/2006/main" xmlns:w14="http://schemas.microsoft.com/office/word/2010/wordml" xmlns:w15="http://schemas.microsoft.com/office/word/2012/wordml" xmlns:w16cex="http://schemas.microsoft.com/office/word/2018/wordml/cex" xmlns:w16cid="http://schemas.microsoft.com/office/word/2016/wordml/cid" xmlns:w16="http://schemas.microsoft.com/office/word/2018/wordml" xmlns:w16du="http://schemas.microsoft.com/office/word/2023/wordml/word16du" xmlns:w16sdtdh="http://schemas.microsoft.com/office/word/2020/wordml/sdtdatahash" xmlns:w16sdtfl="http://schemas.microsoft.com/office/word/2024/wordml/sdtformatlock" xmlns:w16se="http://schemas.microsoft.com/office/word/2015/wordml/symex" xmlns:wpg="http://schemas.microsoft.com/office/word/2010/wordprocessingGroup" xmlns:wpi="http://schemas.microsoft.com/office/word/2010/wordprocessingInk" xmlns:wne="http://schemas.microsoft.com/office/word/2006/wordml" xmlns:wps="http://schemas.microsoft.com/office/word/2010/wordprocessingShape" mc:Ignorable="w14 w15 w16se w16cid w16 w16cex w16sdtdh w16sdtfl w16du wp14">
   <w:abstractNum w:abstractNumId="0" w15:restartNumberingAfterBreak="0">
     <w:nsid w:val="31107324"/>
     <w:multiLevelType w:val="hybridMultilevel"/>
@@ -1671,8 +1818,16 @@
 </w:numbering>
 </file>
 
+<file path=word/people.xml><?xml version="1.0" encoding="utf-8"?>
+<w15:people xmlns:wpc="http://schemas.microsoft.com/office/word/2010/wordprocessingCanvas" xmlns:cx="http://schemas.microsoft.com/office/drawing/2014/chartex" xmlns:cx1="http://schemas.microsoft.com/office/drawing/2015/9/8/chartex" xmlns:cx2="http://schemas.microsoft.com/office/drawing/2015/10/21/chartex" xmlns:cx3="http://schemas.microsoft.com/office/drawing/2016/5/9/chartex" xmlns:cx4="http://schemas.microsoft.com/office/drawing/2016/5/10/chartex" xmlns:cx5="http://schemas.microsoft.com/office/drawing/2016/5/11/chartex" xmlns:cx6="http://schemas.microsoft.com/office/drawing/2016/5/12/chartex" xmlns:cx7="http://schemas.microsoft.com/office/drawing/2016/5/13/chartex" xmlns:cx8="http://schemas.microsoft.com/office/drawing/2016/5/14/chartex" xmlns:mc="http://schemas.openxmlformats.org/markup-compatibility/2006" xmlns:aink="http://schemas.microsoft.com/office/drawing/2016/ink" xmlns:am3d="http://schemas.microsoft.com/office/drawing/2017/model3d" xmlns:o="urn:schemas-microsoft-com:office:office" xmlns:oel="http://schemas.microsoft.com/office/2019/extlst" xmlns:r="http://schemas.openxmlformats.org/officeDocument/2006/relationships" xmlns:m="http://schemas.openxmlformats.org/officeDocument/2006/math" xmlns:v="urn:schemas-microsoft-com:vml" xmlns:wp14="http://schemas.microsoft.com/office/word/2010/wordprocessingDrawing" xmlns:wp="http://schemas.openxmlformats.org/drawingml/2006/wordprocessingDrawing" xmlns:w10="urn:schemas-microsoft-com:office:word" xmlns:w="http://schemas.openxmlformats.org/wordprocessingml/2006/main" xmlns:w14="http://schemas.microsoft.com/office/word/2010/wordml" xmlns:w15="http://schemas.microsoft.com/office/word/2012/wordml" xmlns:w16cex="http://schemas.microsoft.com/office/word/2018/wordml/cex" xmlns:w16cid="http://schemas.microsoft.com/office/word/2016/wordml/cid" xmlns:w16="http://schemas.microsoft.com/office/word/2018/wordml" xmlns:w16du="http://schemas.microsoft.com/office/word/2023/wordml/word16du" xmlns:w16sdtdh="http://schemas.microsoft.com/office/word/2020/wordml/sdtdatahash" xmlns:w16sdtfl="http://schemas.microsoft.com/office/word/2024/wordml/sdtformatlock" xmlns:w16se="http://schemas.microsoft.com/office/word/2015/wordml/symex" xmlns:wpg="http://schemas.microsoft.com/office/word/2010/wordprocessingGroup" xmlns:wpi="http://schemas.microsoft.com/office/word/2010/wordprocessingInk" xmlns:wne="http://schemas.microsoft.com/office/word/2006/wordml" xmlns:wps="http://schemas.microsoft.com/office/word/2010/wordprocessingShape" mc:Ignorable="w14 w15 w16se w16cid w16 w16cex w16sdtdh w16sdtfl w16du wp14">
+  <w15:person w15:author="Badhia Katz">
+    <w15:presenceInfo w15:providerId="AD" w15:userId="S::byuneskatz@flowwest.com::1ca58973-5ad0-4cbc-bc5d-615e27437c92"/>
+  </w15:person>
+</w15:people>
+</file>
+
 <file path=word/styles.xml><?xml version="1.0" encoding="utf-8"?>
-<w:styles xmlns:mc="http://schemas.openxmlformats.org/markup-compatibility/2006" xmlns:r="http://schemas.openxmlformats.org/officeDocument/2006/relationships" xmlns:w="http://schemas.openxmlformats.org/wordprocessingml/2006/main" xmlns:w14="http://schemas.microsoft.com/office/word/2010/wordml" xmlns:w15="http://schemas.microsoft.com/office/word/2012/wordml" xmlns:w16cex="http://schemas.microsoft.com/office/word/2018/wordml/cex" xmlns:w16cid="http://schemas.microsoft.com/office/word/2016/wordml/cid" xmlns:w16="http://schemas.microsoft.com/office/word/2018/wordml" xmlns:w16sdtdh="http://schemas.microsoft.com/office/word/2020/wordml/sdtdatahash" xmlns:w16se="http://schemas.microsoft.com/office/word/2015/wordml/symex" mc:Ignorable="w14 w15 w16se w16cid w16 w16cex w16sdtdh">
+<w:styles xmlns:mc="http://schemas.openxmlformats.org/markup-compatibility/2006" xmlns:r="http://schemas.openxmlformats.org/officeDocument/2006/relationships" xmlns:w="http://schemas.openxmlformats.org/wordprocessingml/2006/main" xmlns:w14="http://schemas.microsoft.com/office/word/2010/wordml" xmlns:w15="http://schemas.microsoft.com/office/word/2012/wordml" xmlns:w16cex="http://schemas.microsoft.com/office/word/2018/wordml/cex" xmlns:w16cid="http://schemas.microsoft.com/office/word/2016/wordml/cid" xmlns:w16="http://schemas.microsoft.com/office/word/2018/wordml" xmlns:w16du="http://schemas.microsoft.com/office/word/2023/wordml/word16du" xmlns:w16sdtdh="http://schemas.microsoft.com/office/word/2020/wordml/sdtdatahash" xmlns:w16sdtfl="http://schemas.microsoft.com/office/word/2024/wordml/sdtformatlock" xmlns:w16se="http://schemas.microsoft.com/office/word/2015/wordml/symex" mc:Ignorable="w14 w15 w16se w16cid w16 w16cex w16sdtdh w16sdtfl w16du">
   <w:docDefaults>
     <w:rPrDefault>
       <w:rPr>

</xml_diff>

<commit_message>
accepts revisions to methods docx
</commit_message>
<xml_diff>
--- a/data-raw/metadata/methods.docx
+++ b/data-raw/metadata/methods.docx
@@ -70,8 +70,18 @@
           <w:sz w:val="24"/>
           <w:szCs w:val="24"/>
         </w:rPr>
-        <w:t xml:space="preserve"> Riverwatcher</w:t>
-      </w:r>
+        <w:t xml:space="preserve"> </w:t>
+      </w:r>
+      <w:proofErr w:type="spellStart"/>
+      <w:r>
+        <w:rPr>
+          <w:rFonts w:ascii="Aptos" w:hAnsi="Aptos"/>
+          <w:sz w:val="24"/>
+          <w:szCs w:val="24"/>
+        </w:rPr>
+        <w:t>Riverwatcher</w:t>
+      </w:r>
+      <w:proofErr w:type="spellEnd"/>
     </w:p>
     <w:p>
       <w:pPr>
@@ -168,7 +178,27 @@
           <w:sz w:val="24"/>
           <w:szCs w:val="24"/>
         </w:rPr>
-        <w:t xml:space="preserve"> VAKI Riverwatcher™</w:t>
+        <w:t xml:space="preserve"> VAKI </w:t>
+      </w:r>
+      <w:proofErr w:type="spellStart"/>
+      <w:r>
+        <w:rPr>
+          <w:rFonts w:ascii="Aptos" w:eastAsia="Times New Roman" w:hAnsi="Aptos" w:cs="Arial"/>
+          <w:color w:val="000000"/>
+          <w:sz w:val="24"/>
+          <w:szCs w:val="24"/>
+        </w:rPr>
+        <w:t>Riverwatcher</w:t>
+      </w:r>
+      <w:proofErr w:type="spellEnd"/>
+      <w:r>
+        <w:rPr>
+          <w:rFonts w:ascii="Aptos" w:eastAsia="Times New Roman" w:hAnsi="Aptos" w:cs="Arial"/>
+          <w:color w:val="000000"/>
+          <w:sz w:val="24"/>
+          <w:szCs w:val="24"/>
+        </w:rPr>
+        <w:t>™</w:t>
       </w:r>
       <w:r>
         <w:rPr>
@@ -231,7 +261,27 @@
           <w:sz w:val="24"/>
           <w:szCs w:val="24"/>
         </w:rPr>
-        <w:t xml:space="preserve"> This dataset is considered to be a census for spring run chinook because mostly all spawn upstream of Daguerre </w:t>
+        <w:t xml:space="preserve"> This dataset </w:t>
+      </w:r>
+      <w:proofErr w:type="gramStart"/>
+      <w:r>
+        <w:rPr>
+          <w:rFonts w:ascii="Aptos" w:eastAsia="Times New Roman" w:hAnsi="Aptos" w:cs="Arial"/>
+          <w:color w:val="000000"/>
+          <w:sz w:val="24"/>
+          <w:szCs w:val="24"/>
+        </w:rPr>
+        <w:t>is considered to be</w:t>
+      </w:r>
+      <w:proofErr w:type="gramEnd"/>
+      <w:r>
+        <w:rPr>
+          <w:rFonts w:ascii="Aptos" w:eastAsia="Times New Roman" w:hAnsi="Aptos" w:cs="Arial"/>
+          <w:color w:val="000000"/>
+          <w:sz w:val="24"/>
+          <w:szCs w:val="24"/>
+        </w:rPr>
+        <w:t xml:space="preserve"> a census for spring run chinook because mostly all spawn upstream of Daguerre </w:t>
       </w:r>
       <w:r>
         <w:rPr>
@@ -249,73 +299,7 @@
           <w:sz w:val="24"/>
           <w:szCs w:val="24"/>
         </w:rPr>
-        <w:t xml:space="preserve">Dam. Passage estimates using the adult upstream data have been modeled for 2004 </w:t>
-      </w:r>
-      <w:r>
-        <w:rPr>
-          <w:rFonts w:ascii="Aptos" w:eastAsia="Times New Roman" w:hAnsi="Aptos" w:cs="Arial"/>
-          <w:color w:val="000000"/>
-          <w:sz w:val="24"/>
-          <w:szCs w:val="24"/>
-        </w:rPr>
-        <w:t>–</w:t>
-      </w:r>
-      <w:r>
-        <w:rPr>
-          <w:rFonts w:ascii="Aptos" w:eastAsia="Times New Roman" w:hAnsi="Aptos" w:cs="Arial"/>
-          <w:color w:val="000000"/>
-          <w:sz w:val="24"/>
-          <w:szCs w:val="24"/>
-        </w:rPr>
-        <w:t xml:space="preserve"> </w:t>
-      </w:r>
-      <w:commentRangeStart w:id="0"/>
-      <w:r>
-        <w:rPr>
-          <w:rFonts w:ascii="Aptos" w:eastAsia="Times New Roman" w:hAnsi="Aptos" w:cs="Arial"/>
-          <w:color w:val="000000"/>
-          <w:sz w:val="24"/>
-          <w:szCs w:val="24"/>
-        </w:rPr>
-        <w:t>202</w:t>
-      </w:r>
-      <w:r>
-        <w:rPr>
-          <w:rFonts w:ascii="Aptos" w:eastAsia="Times New Roman" w:hAnsi="Aptos" w:cs="Arial"/>
-          <w:color w:val="000000"/>
-          <w:sz w:val="24"/>
-          <w:szCs w:val="24"/>
-        </w:rPr>
-        <w:t>3</w:t>
-      </w:r>
-      <w:commentRangeEnd w:id="0"/>
-      <w:r>
-        <w:rPr>
-          <w:rStyle w:val="CommentReference"/>
-          <w:rFonts w:ascii="Aptos" w:eastAsia="Times New Roman" w:hAnsi="Aptos" w:cs="Arial"/>
-          <w:color w:val="000000"/>
-          <w:sz w:val="24"/>
-          <w:szCs w:val="24"/>
-        </w:rPr>
-        <w:commentReference w:id="0"/>
-      </w:r>
-      <w:r>
-        <w:rPr>
-          <w:rFonts w:ascii="Aptos" w:eastAsia="Times New Roman" w:hAnsi="Aptos" w:cs="Arial"/>
-          <w:color w:val="000000"/>
-          <w:sz w:val="24"/>
-          <w:szCs w:val="24"/>
-        </w:rPr>
-        <w:t xml:space="preserve">. </w:t>
-      </w:r>
-      <w:r>
-        <w:rPr>
-          <w:rFonts w:ascii="Aptos" w:eastAsia="Times New Roman" w:hAnsi="Aptos" w:cs="Arial"/>
-          <w:color w:val="000000"/>
-          <w:sz w:val="24"/>
-          <w:szCs w:val="24"/>
-        </w:rPr>
-        <w:t>The modeling approach involves determining the run and interpolating for missing data. </w:t>
+        <w:t>Dam. The modeling approach involves determining the run and interpolating for missing data. </w:t>
       </w:r>
     </w:p>
     <w:p>
@@ -377,7 +361,27 @@
           <w:sz w:val="24"/>
           <w:szCs w:val="24"/>
         </w:rPr>
-        <w:t>Instantaneous passage records: data in this file form the base dataset for analyses and methodologies identified in Poxon and Bratovich (2020).</w:t>
+        <w:t xml:space="preserve">Instantaneous passage records: data in this file form the base dataset for analyses and methodologies identified in Poxon and </w:t>
+      </w:r>
+      <w:proofErr w:type="spellStart"/>
+      <w:r>
+        <w:rPr>
+          <w:rFonts w:ascii="Aptos" w:eastAsia="Times New Roman" w:hAnsi="Aptos" w:cs="Arial"/>
+          <w:color w:val="000000"/>
+          <w:sz w:val="24"/>
+          <w:szCs w:val="24"/>
+        </w:rPr>
+        <w:t>Bratovich</w:t>
+      </w:r>
+      <w:proofErr w:type="spellEnd"/>
+      <w:r>
+        <w:rPr>
+          <w:rFonts w:ascii="Aptos" w:eastAsia="Times New Roman" w:hAnsi="Aptos" w:cs="Arial"/>
+          <w:color w:val="000000"/>
+          <w:sz w:val="24"/>
+          <w:szCs w:val="24"/>
+        </w:rPr>
+        <w:t xml:space="preserve"> (2020).</w:t>
       </w:r>
       <w:r>
         <w:rPr>
@@ -471,7 +475,27 @@
           <w:sz w:val="24"/>
           <w:szCs w:val="24"/>
         </w:rPr>
-        <w:t>s presented in Poxon &amp; Bratovich (2020).</w:t>
+        <w:t xml:space="preserve">s presented in Poxon &amp; </w:t>
+      </w:r>
+      <w:proofErr w:type="spellStart"/>
+      <w:r>
+        <w:rPr>
+          <w:rFonts w:ascii="Aptos" w:eastAsia="Times New Roman" w:hAnsi="Aptos" w:cs="Arial"/>
+          <w:color w:val="000000"/>
+          <w:sz w:val="24"/>
+          <w:szCs w:val="24"/>
+        </w:rPr>
+        <w:t>Bratovich</w:t>
+      </w:r>
+      <w:proofErr w:type="spellEnd"/>
+      <w:r>
+        <w:rPr>
+          <w:rFonts w:ascii="Aptos" w:eastAsia="Times New Roman" w:hAnsi="Aptos" w:cs="Arial"/>
+          <w:color w:val="000000"/>
+          <w:sz w:val="24"/>
+          <w:szCs w:val="24"/>
+        </w:rPr>
+        <w:t xml:space="preserve"> (2020).</w:t>
       </w:r>
       <w:r>
         <w:rPr>
@@ -583,7 +607,27 @@
           <w:sz w:val="24"/>
           <w:szCs w:val="24"/>
         </w:rPr>
-        <w:t xml:space="preserve">Data in this file represent the output (results) from the count correction and run differentiation analyses presented in Poxon and Bratovich (2020). Please </w:t>
+        <w:t xml:space="preserve">Data in this file represent the output (results) from the count correction and run differentiation analyses presented in Poxon and </w:t>
+      </w:r>
+      <w:proofErr w:type="spellStart"/>
+      <w:r>
+        <w:rPr>
+          <w:rFonts w:ascii="Aptos" w:eastAsia="Times New Roman" w:hAnsi="Aptos" w:cs="Arial"/>
+          <w:color w:val="000000"/>
+          <w:sz w:val="24"/>
+          <w:szCs w:val="24"/>
+        </w:rPr>
+        <w:t>Bratovich</w:t>
+      </w:r>
+      <w:proofErr w:type="spellEnd"/>
+      <w:r>
+        <w:rPr>
+          <w:rFonts w:ascii="Aptos" w:eastAsia="Times New Roman" w:hAnsi="Aptos" w:cs="Arial"/>
+          <w:color w:val="000000"/>
+          <w:sz w:val="24"/>
+          <w:szCs w:val="24"/>
+        </w:rPr>
+        <w:t xml:space="preserve"> (2020). Please </w:t>
       </w:r>
       <w:r>
         <w:rPr>
@@ -758,7 +802,27 @@
           <w:sz w:val="24"/>
           <w:szCs w:val="24"/>
         </w:rPr>
-        <w:t xml:space="preserve"> as outlined in Poxon and Bratovich (2020). </w:t>
+        <w:t xml:space="preserve"> as outlined in Poxon and </w:t>
+      </w:r>
+      <w:proofErr w:type="spellStart"/>
+      <w:r>
+        <w:rPr>
+          <w:rFonts w:ascii="Aptos" w:eastAsia="Times New Roman" w:hAnsi="Aptos" w:cs="Arial"/>
+          <w:color w:val="000000"/>
+          <w:sz w:val="24"/>
+          <w:szCs w:val="24"/>
+        </w:rPr>
+        <w:t>Bratovich</w:t>
+      </w:r>
+      <w:proofErr w:type="spellEnd"/>
+      <w:r>
+        <w:rPr>
+          <w:rFonts w:ascii="Aptos" w:eastAsia="Times New Roman" w:hAnsi="Aptos" w:cs="Arial"/>
+          <w:color w:val="000000"/>
+          <w:sz w:val="24"/>
+          <w:szCs w:val="24"/>
+        </w:rPr>
+        <w:t xml:space="preserve"> (2020). </w:t>
       </w:r>
     </w:p>
     <w:p>
@@ -789,7 +853,27 @@
           <w:sz w:val="24"/>
           <w:szCs w:val="24"/>
         </w:rPr>
-        <w:t xml:space="preserve">The 2016 and 2017 annual time series were deemed inappropriate for count correction and run separation analyses due to long periods of VAKI Riverwatcher™ system outages that resulted in incomplete datasets for both years. No estimates (run-differentiated or overall) </w:t>
+        <w:t xml:space="preserve">The 2016 and 2017 annual time series were deemed inappropriate for count correction and run separation analyses due to long periods of VAKI </w:t>
+      </w:r>
+      <w:proofErr w:type="spellStart"/>
+      <w:r>
+        <w:rPr>
+          <w:rFonts w:ascii="Aptos" w:eastAsia="Times New Roman" w:hAnsi="Aptos" w:cs="Arial"/>
+          <w:color w:val="000000"/>
+          <w:sz w:val="24"/>
+          <w:szCs w:val="24"/>
+        </w:rPr>
+        <w:t>Riverwatcher</w:t>
+      </w:r>
+      <w:proofErr w:type="spellEnd"/>
+      <w:r>
+        <w:rPr>
+          <w:rFonts w:ascii="Aptos" w:eastAsia="Times New Roman" w:hAnsi="Aptos" w:cs="Arial"/>
+          <w:color w:val="000000"/>
+          <w:sz w:val="24"/>
+          <w:szCs w:val="24"/>
+        </w:rPr>
+        <w:t xml:space="preserve">™ system outages that resulted in incomplete datasets for both years. No estimates (run-differentiated or overall) are possible for these years. The total number of Chinook salmon for these years represent </w:t>
       </w:r>
       <w:r>
         <w:rPr>
@@ -799,7 +883,27 @@
           <w:szCs w:val="24"/>
         </w:rPr>
         <w:lastRenderedPageBreak/>
-        <w:t xml:space="preserve">are possible for these years. The total number of Chinook salmon for these years represent raw counts as affected by VAKI Riverwatcher™ system outages, and do not represent estimated annual abundances. </w:t>
+        <w:t xml:space="preserve">raw counts as affected by VAKI </w:t>
+      </w:r>
+      <w:proofErr w:type="spellStart"/>
+      <w:r>
+        <w:rPr>
+          <w:rFonts w:ascii="Aptos" w:eastAsia="Times New Roman" w:hAnsi="Aptos" w:cs="Arial"/>
+          <w:color w:val="000000"/>
+          <w:sz w:val="24"/>
+          <w:szCs w:val="24"/>
+        </w:rPr>
+        <w:t>Riverwatcher</w:t>
+      </w:r>
+      <w:proofErr w:type="spellEnd"/>
+      <w:r>
+        <w:rPr>
+          <w:rFonts w:ascii="Aptos" w:eastAsia="Times New Roman" w:hAnsi="Aptos" w:cs="Arial"/>
+          <w:color w:val="000000"/>
+          <w:sz w:val="24"/>
+          <w:szCs w:val="24"/>
+        </w:rPr>
+        <w:t xml:space="preserve">™ system outages, and do not represent estimated annual abundances. </w:t>
       </w:r>
     </w:p>
     <w:p>
@@ -830,16 +934,56 @@
           <w:sz w:val="24"/>
           <w:szCs w:val="24"/>
         </w:rPr>
-        <w:t>Additionally, run-type differentiation was not possible for biological year 2019 due to an extended closure (February 13, 2019 through September 10, 2019) of the DPD North Ladder, which fundamentally altered the temporal patterns of passage at DPD on which the run differentiation analysis is based. As a result, the only possible annual abundance estimate for the 2019 annual time series is Total Chinook Salmon.</w:t>
-      </w:r>
-      <w:r>
-        <w:rPr>
-          <w:rFonts w:ascii="Aptos" w:eastAsia="Times New Roman" w:hAnsi="Aptos" w:cs="Arial"/>
-          <w:color w:val="000000"/>
-          <w:sz w:val="24"/>
-          <w:szCs w:val="24"/>
-        </w:rPr>
-        <w:t xml:space="preserve"> Table 1 in Poxon and Bratovich (2020), which did not acknowledge the limitations of 2019 data preclud</w:t>
+        <w:t xml:space="preserve">Additionally, run-type differentiation was not possible for biological year 2019 due to an extended closure (February 13, </w:t>
+      </w:r>
+      <w:proofErr w:type="gramStart"/>
+      <w:r>
+        <w:rPr>
+          <w:rFonts w:ascii="Aptos" w:eastAsia="Times New Roman" w:hAnsi="Aptos" w:cs="Arial"/>
+          <w:color w:val="000000"/>
+          <w:sz w:val="24"/>
+          <w:szCs w:val="24"/>
+        </w:rPr>
+        <w:t>2019</w:t>
+      </w:r>
+      <w:proofErr w:type="gramEnd"/>
+      <w:r>
+        <w:rPr>
+          <w:rFonts w:ascii="Aptos" w:eastAsia="Times New Roman" w:hAnsi="Aptos" w:cs="Arial"/>
+          <w:color w:val="000000"/>
+          <w:sz w:val="24"/>
+          <w:szCs w:val="24"/>
+        </w:rPr>
+        <w:t xml:space="preserve"> through September 10, 2019) of the DPD North Ladder, which fundamentally altered the temporal patterns of passage at DPD on which the run differentiation analysis is based. As a result, the only possible annual abundance estimate for the 2019 annual time series is Total Chinook Salmon.</w:t>
+      </w:r>
+      <w:r>
+        <w:rPr>
+          <w:rFonts w:ascii="Aptos" w:eastAsia="Times New Roman" w:hAnsi="Aptos" w:cs="Arial"/>
+          <w:color w:val="000000"/>
+          <w:sz w:val="24"/>
+          <w:szCs w:val="24"/>
+        </w:rPr>
+        <w:t xml:space="preserve"> Table 1 in Poxon and </w:t>
+      </w:r>
+      <w:proofErr w:type="spellStart"/>
+      <w:r>
+        <w:rPr>
+          <w:rFonts w:ascii="Aptos" w:eastAsia="Times New Roman" w:hAnsi="Aptos" w:cs="Arial"/>
+          <w:color w:val="000000"/>
+          <w:sz w:val="24"/>
+          <w:szCs w:val="24"/>
+        </w:rPr>
+        <w:t>Bratovich</w:t>
+      </w:r>
+      <w:proofErr w:type="spellEnd"/>
+      <w:r>
+        <w:rPr>
+          <w:rFonts w:ascii="Aptos" w:eastAsia="Times New Roman" w:hAnsi="Aptos" w:cs="Arial"/>
+          <w:color w:val="000000"/>
+          <w:sz w:val="24"/>
+          <w:szCs w:val="24"/>
+        </w:rPr>
+        <w:t xml:space="preserve"> (2020), which did not acknowledge the limitations of 2019 data preclud</w:t>
       </w:r>
       <w:r>
         <w:rPr>
@@ -866,61 +1010,75 @@
           <w:sz w:val="24"/>
           <w:szCs w:val="24"/>
         </w:rPr>
-        <w:t>by Table 1 in Poxon and Bratovich (202</w:t>
-      </w:r>
-      <w:del w:id="1" w:author="Badhia Katz" w:date="2026-02-23T11:42:00Z" w16du:dateUtc="2026-02-23T19:42:00Z">
-        <w:r>
-          <w:rPr>
-            <w:rFonts w:ascii="Aptos" w:eastAsia="Times New Roman" w:hAnsi="Aptos" w:cs="Arial"/>
-            <w:color w:val="000000"/>
-            <w:sz w:val="24"/>
-            <w:szCs w:val="24"/>
-          </w:rPr>
-          <w:delText>3</w:delText>
-        </w:r>
-      </w:del>
-      <w:ins w:id="2" w:author="Badhia Katz" w:date="2026-02-23T11:42:00Z" w16du:dateUtc="2026-02-23T19:42:00Z">
-        <w:r>
-          <w:rPr>
-            <w:rFonts w:ascii="Aptos" w:eastAsia="Times New Roman" w:hAnsi="Aptos" w:cs="Arial"/>
-            <w:color w:val="000000"/>
-            <w:sz w:val="24"/>
-            <w:szCs w:val="24"/>
-          </w:rPr>
-          <w:t>4</w:t>
-        </w:r>
-      </w:ins>
-      <w:r>
-        <w:rPr>
-          <w:rFonts w:ascii="Aptos" w:eastAsia="Times New Roman" w:hAnsi="Aptos" w:cs="Arial"/>
-          <w:color w:val="000000"/>
-          <w:sz w:val="24"/>
-          <w:szCs w:val="24"/>
-        </w:rPr>
-        <w:t>). Table 1 in Poxon and Bratovich (202</w:t>
-      </w:r>
-      <w:ins w:id="3" w:author="Badhia Katz" w:date="2026-02-23T11:42:00Z" w16du:dateUtc="2026-02-23T19:42:00Z">
-        <w:r>
-          <w:rPr>
-            <w:rFonts w:ascii="Aptos" w:eastAsia="Times New Roman" w:hAnsi="Aptos" w:cs="Arial"/>
-            <w:color w:val="000000"/>
-            <w:sz w:val="24"/>
-            <w:szCs w:val="24"/>
-          </w:rPr>
-          <w:t>4</w:t>
-        </w:r>
-      </w:ins>
-      <w:del w:id="4" w:author="Badhia Katz" w:date="2026-02-23T11:42:00Z" w16du:dateUtc="2026-02-23T19:42:00Z">
-        <w:r>
-          <w:rPr>
-            <w:rFonts w:ascii="Aptos" w:eastAsia="Times New Roman" w:hAnsi="Aptos" w:cs="Arial"/>
-            <w:color w:val="000000"/>
-            <w:sz w:val="24"/>
-            <w:szCs w:val="24"/>
-          </w:rPr>
-          <w:delText>3</w:delText>
-        </w:r>
-      </w:del>
+        <w:t xml:space="preserve">by Table 1 in Poxon and </w:t>
+      </w:r>
+      <w:proofErr w:type="spellStart"/>
+      <w:r>
+        <w:rPr>
+          <w:rFonts w:ascii="Aptos" w:eastAsia="Times New Roman" w:hAnsi="Aptos" w:cs="Arial"/>
+          <w:color w:val="000000"/>
+          <w:sz w:val="24"/>
+          <w:szCs w:val="24"/>
+        </w:rPr>
+        <w:t>Bratovich</w:t>
+      </w:r>
+      <w:proofErr w:type="spellEnd"/>
+      <w:r>
+        <w:rPr>
+          <w:rFonts w:ascii="Aptos" w:eastAsia="Times New Roman" w:hAnsi="Aptos" w:cs="Arial"/>
+          <w:color w:val="000000"/>
+          <w:sz w:val="24"/>
+          <w:szCs w:val="24"/>
+        </w:rPr>
+        <w:t xml:space="preserve"> (202</w:t>
+      </w:r>
+      <w:r>
+        <w:rPr>
+          <w:rFonts w:ascii="Aptos" w:eastAsia="Times New Roman" w:hAnsi="Aptos" w:cs="Arial"/>
+          <w:color w:val="000000"/>
+          <w:sz w:val="24"/>
+          <w:szCs w:val="24"/>
+        </w:rPr>
+        <w:t>4</w:t>
+      </w:r>
+      <w:r>
+        <w:rPr>
+          <w:rFonts w:ascii="Aptos" w:eastAsia="Times New Roman" w:hAnsi="Aptos" w:cs="Arial"/>
+          <w:color w:val="000000"/>
+          <w:sz w:val="24"/>
+          <w:szCs w:val="24"/>
+        </w:rPr>
+        <w:t xml:space="preserve">). Table 1 in Poxon and </w:t>
+      </w:r>
+      <w:proofErr w:type="spellStart"/>
+      <w:r>
+        <w:rPr>
+          <w:rFonts w:ascii="Aptos" w:eastAsia="Times New Roman" w:hAnsi="Aptos" w:cs="Arial"/>
+          <w:color w:val="000000"/>
+          <w:sz w:val="24"/>
+          <w:szCs w:val="24"/>
+        </w:rPr>
+        <w:t>Bratovich</w:t>
+      </w:r>
+      <w:proofErr w:type="spellEnd"/>
+      <w:r>
+        <w:rPr>
+          <w:rFonts w:ascii="Aptos" w:eastAsia="Times New Roman" w:hAnsi="Aptos" w:cs="Arial"/>
+          <w:color w:val="000000"/>
+          <w:sz w:val="24"/>
+          <w:szCs w:val="24"/>
+        </w:rPr>
+        <w:t xml:space="preserve"> (202</w:t>
+      </w:r>
+      <w:r>
+        <w:rPr>
+          <w:rFonts w:ascii="Aptos" w:eastAsia="Times New Roman" w:hAnsi="Aptos" w:cs="Arial"/>
+          <w:color w:val="000000"/>
+          <w:sz w:val="24"/>
+          <w:szCs w:val="24"/>
+        </w:rPr>
+        <w:t>4</w:t>
+      </w:r>
       <w:r>
         <w:rPr>
           <w:rFonts w:ascii="Aptos" w:eastAsia="Times New Roman" w:hAnsi="Aptos" w:cs="Arial"/>
@@ -930,28 +1088,15 @@
         </w:rPr>
         <w:t>) is also expanded to include results of count correction and run differentiation analyses for biological years 2020 through 202</w:t>
       </w:r>
-      <w:ins w:id="5" w:author="Badhia Katz" w:date="2026-02-23T11:42:00Z" w16du:dateUtc="2026-02-23T19:42:00Z">
-        <w:r>
-          <w:rPr>
-            <w:rFonts w:ascii="Aptos" w:eastAsia="Times New Roman" w:hAnsi="Aptos" w:cs="Arial"/>
-            <w:color w:val="000000"/>
-            <w:sz w:val="24"/>
-            <w:szCs w:val="24"/>
-          </w:rPr>
-          <w:t>4</w:t>
-        </w:r>
-      </w:ins>
-      <w:del w:id="6" w:author="Badhia Katz" w:date="2026-02-23T11:42:00Z" w16du:dateUtc="2026-02-23T19:42:00Z">
-        <w:r>
-          <w:rPr>
-            <w:rFonts w:ascii="Aptos" w:eastAsia="Times New Roman" w:hAnsi="Aptos" w:cs="Arial"/>
-            <w:color w:val="000000"/>
-            <w:sz w:val="24"/>
-            <w:szCs w:val="24"/>
-          </w:rPr>
-          <w:delText>2</w:delText>
-        </w:r>
-      </w:del>
+      <w:r>
+        <w:rPr>
+          <w:rFonts w:ascii="Aptos" w:eastAsia="Times New Roman" w:hAnsi="Aptos" w:cs="Arial"/>
+          <w:color w:val="000000"/>
+          <w:sz w:val="24"/>
+          <w:szCs w:val="24"/>
+        </w:rPr>
+        <w:t>4</w:t>
+      </w:r>
       <w:r>
         <w:rPr>
           <w:rFonts w:ascii="Aptos" w:eastAsia="Times New Roman" w:hAnsi="Aptos" w:cs="Arial"/>
@@ -1017,7 +1162,25 @@
           <w:sz w:val="24"/>
           <w:szCs w:val="24"/>
         </w:rPr>
-        <w:t xml:space="preserve">Poxon, B. and Bratovich, P. 2020. Lower Yuba River </w:t>
+        <w:t xml:space="preserve">Poxon, B. and </w:t>
+      </w:r>
+      <w:proofErr w:type="spellStart"/>
+      <w:r>
+        <w:rPr>
+          <w:rFonts w:ascii="Aptos" w:eastAsia="Times New Roman" w:hAnsi="Aptos" w:cs="Arial"/>
+          <w:sz w:val="24"/>
+          <w:szCs w:val="24"/>
+        </w:rPr>
+        <w:t>Bratovich</w:t>
+      </w:r>
+      <w:proofErr w:type="spellEnd"/>
+      <w:r>
+        <w:rPr>
+          <w:rFonts w:ascii="Aptos" w:eastAsia="Times New Roman" w:hAnsi="Aptos" w:cs="Arial"/>
+          <w:sz w:val="24"/>
+          <w:szCs w:val="24"/>
+        </w:rPr>
+        <w:t xml:space="preserve">, P. 2020. Lower Yuba River </w:t>
       </w:r>
       <w:r>
         <w:rPr>
@@ -1035,6 +1198,7 @@
         </w:rPr>
         <w:t xml:space="preserve"> </w:t>
       </w:r>
+      <w:proofErr w:type="spellStart"/>
       <w:r>
         <w:rPr>
           <w:rFonts w:ascii="Aptos" w:eastAsia="Times New Roman" w:hAnsi="Aptos" w:cs="Arial"/>
@@ -1043,6 +1207,7 @@
         </w:rPr>
         <w:t>Riverwatcher</w:t>
       </w:r>
+      <w:proofErr w:type="spellEnd"/>
       <w:r>
         <w:rPr>
           <w:rFonts w:ascii="Aptos" w:eastAsia="Times New Roman" w:hAnsi="Aptos" w:cs="Arial"/>
@@ -1101,28 +1266,34 @@
           <w:sz w:val="24"/>
           <w:szCs w:val="24"/>
         </w:rPr>
-        <w:t>Poxon, B. and Bratovich, P. 202</w:t>
-      </w:r>
-      <w:del w:id="7" w:author="Badhia Katz" w:date="2026-02-23T11:41:00Z" w16du:dateUtc="2026-02-23T19:41:00Z">
-        <w:r>
-          <w:rPr>
-            <w:rFonts w:ascii="Aptos" w:eastAsia="Times New Roman" w:hAnsi="Aptos" w:cs="Arial"/>
-            <w:sz w:val="24"/>
-            <w:szCs w:val="24"/>
-          </w:rPr>
-          <w:delText>3</w:delText>
-        </w:r>
-      </w:del>
-      <w:ins w:id="8" w:author="Badhia Katz" w:date="2026-02-23T11:41:00Z" w16du:dateUtc="2026-02-23T19:41:00Z">
-        <w:r>
-          <w:rPr>
-            <w:rFonts w:ascii="Aptos" w:eastAsia="Times New Roman" w:hAnsi="Aptos" w:cs="Arial"/>
-            <w:sz w:val="24"/>
-            <w:szCs w:val="24"/>
-          </w:rPr>
-          <w:t>4</w:t>
-        </w:r>
-      </w:ins>
+        <w:t xml:space="preserve">Poxon, B. and </w:t>
+      </w:r>
+      <w:proofErr w:type="spellStart"/>
+      <w:r>
+        <w:rPr>
+          <w:rFonts w:ascii="Aptos" w:eastAsia="Times New Roman" w:hAnsi="Aptos" w:cs="Arial"/>
+          <w:sz w:val="24"/>
+          <w:szCs w:val="24"/>
+        </w:rPr>
+        <w:t>Bratovich</w:t>
+      </w:r>
+      <w:proofErr w:type="spellEnd"/>
+      <w:r>
+        <w:rPr>
+          <w:rFonts w:ascii="Aptos" w:eastAsia="Times New Roman" w:hAnsi="Aptos" w:cs="Arial"/>
+          <w:sz w:val="24"/>
+          <w:szCs w:val="24"/>
+        </w:rPr>
+        <w:t>, P. 202</w:t>
+      </w:r>
+      <w:r>
+        <w:rPr>
+          <w:rFonts w:ascii="Aptos" w:eastAsia="Times New Roman" w:hAnsi="Aptos" w:cs="Arial"/>
+          <w:sz w:val="24"/>
+          <w:szCs w:val="24"/>
+        </w:rPr>
+        <w:t>4</w:t>
+      </w:r>
       <w:r>
         <w:rPr>
           <w:rFonts w:ascii="Aptos" w:eastAsia="Times New Roman" w:hAnsi="Aptos" w:cs="Arial"/>
@@ -1145,8 +1316,18 @@
           <w:sz w:val="24"/>
           <w:szCs w:val="24"/>
         </w:rPr>
-        <w:t xml:space="preserve"> Lower Yuba River VAKI Riverwatcher</w:t>
-      </w:r>
+        <w:t xml:space="preserve"> Lower Yuba River VAKI </w:t>
+      </w:r>
+      <w:proofErr w:type="spellStart"/>
+      <w:r>
+        <w:rPr>
+          <w:rFonts w:ascii="Aptos" w:eastAsia="Times New Roman" w:hAnsi="Aptos" w:cs="Arial"/>
+          <w:sz w:val="24"/>
+          <w:szCs w:val="24"/>
+        </w:rPr>
+        <w:t>Riverwatcher</w:t>
+      </w:r>
+      <w:proofErr w:type="spellEnd"/>
       <w:r>
         <w:rPr>
           <w:rFonts w:ascii="Aptos" w:eastAsia="Times New Roman" w:hAnsi="Aptos" w:cs="Arial"/>
@@ -1155,26 +1336,14 @@
         </w:rPr>
         <w:t>™ Chinook Salmon Passage and Run Differentiation Analyses for Biological Years 2004-202</w:t>
       </w:r>
-      <w:ins w:id="9" w:author="Badhia Katz" w:date="2026-02-23T11:41:00Z" w16du:dateUtc="2026-02-23T19:41:00Z">
-        <w:r>
-          <w:rPr>
-            <w:rFonts w:ascii="Aptos" w:eastAsia="Times New Roman" w:hAnsi="Aptos" w:cs="Arial"/>
-            <w:sz w:val="24"/>
-            <w:szCs w:val="24"/>
-          </w:rPr>
-          <w:t>4</w:t>
-        </w:r>
-      </w:ins>
-      <w:del w:id="10" w:author="Badhia Katz" w:date="2026-02-23T11:41:00Z" w16du:dateUtc="2026-02-23T19:41:00Z">
-        <w:r>
-          <w:rPr>
-            <w:rFonts w:ascii="Aptos" w:eastAsia="Times New Roman" w:hAnsi="Aptos" w:cs="Arial"/>
-            <w:sz w:val="24"/>
-            <w:szCs w:val="24"/>
-          </w:rPr>
-          <w:delText>2</w:delText>
-        </w:r>
-      </w:del>
+      <w:r>
+        <w:rPr>
+          <w:rFonts w:ascii="Aptos" w:eastAsia="Times New Roman" w:hAnsi="Aptos" w:cs="Arial"/>
+          <w:sz w:val="24"/>
+          <w:szCs w:val="24"/>
+        </w:rPr>
+        <w:t>4</w:t>
+      </w:r>
       <w:r>
         <w:rPr>
           <w:rFonts w:ascii="Aptos" w:eastAsia="Times New Roman" w:hAnsi="Aptos" w:cs="Arial"/>
@@ -1192,45 +1361,6 @@
     </w:sectPr>
   </w:body>
 </w:document>
-</file>
-
-<file path=word/comments.xml><?xml version="1.0" encoding="utf-8"?>
-<w:comments xmlns:wpc="http://schemas.microsoft.com/office/word/2010/wordprocessingCanvas" xmlns:cx="http://schemas.microsoft.com/office/drawing/2014/chartex" xmlns:cx1="http://schemas.microsoft.com/office/drawing/2015/9/8/chartex" xmlns:cx2="http://schemas.microsoft.com/office/drawing/2015/10/21/chartex" xmlns:cx3="http://schemas.microsoft.com/office/drawing/2016/5/9/chartex" xmlns:cx4="http://schemas.microsoft.com/office/drawing/2016/5/10/chartex" xmlns:cx5="http://schemas.microsoft.com/office/drawing/2016/5/11/chartex" xmlns:cx6="http://schemas.microsoft.com/office/drawing/2016/5/12/chartex" xmlns:cx7="http://schemas.microsoft.com/office/drawing/2016/5/13/chartex" xmlns:cx8="http://schemas.microsoft.com/office/drawing/2016/5/14/chartex" xmlns:mc="http://schemas.openxmlformats.org/markup-compatibility/2006" xmlns:aink="http://schemas.microsoft.com/office/drawing/2016/ink" xmlns:am3d="http://schemas.microsoft.com/office/drawing/2017/model3d" xmlns:o="urn:schemas-microsoft-com:office:office" xmlns:oel="http://schemas.microsoft.com/office/2019/extlst" xmlns:r="http://schemas.openxmlformats.org/officeDocument/2006/relationships" xmlns:m="http://schemas.openxmlformats.org/officeDocument/2006/math" xmlns:v="urn:schemas-microsoft-com:vml" xmlns:wp14="http://schemas.microsoft.com/office/word/2010/wordprocessingDrawing" xmlns:wp="http://schemas.openxmlformats.org/drawingml/2006/wordprocessingDrawing" xmlns:w10="urn:schemas-microsoft-com:office:word" xmlns:w="http://schemas.openxmlformats.org/wordprocessingml/2006/main" xmlns:w14="http://schemas.microsoft.com/office/word/2010/wordml" xmlns:w15="http://schemas.microsoft.com/office/word/2012/wordml" xmlns:w16cex="http://schemas.microsoft.com/office/word/2018/wordml/cex" xmlns:w16cid="http://schemas.microsoft.com/office/word/2016/wordml/cid" xmlns:w16="http://schemas.microsoft.com/office/word/2018/wordml" xmlns:w16du="http://schemas.microsoft.com/office/word/2023/wordml/word16du" xmlns:w16sdtdh="http://schemas.microsoft.com/office/word/2020/wordml/sdtdatahash" xmlns:w16sdtfl="http://schemas.microsoft.com/office/word/2024/wordml/sdtformatlock" xmlns:w16se="http://schemas.microsoft.com/office/word/2015/wordml/symex" xmlns:wpg="http://schemas.microsoft.com/office/word/2010/wordprocessingGroup" xmlns:wpi="http://schemas.microsoft.com/office/word/2010/wordprocessingInk" xmlns:wne="http://schemas.microsoft.com/office/word/2006/wordml" xmlns:wps="http://schemas.microsoft.com/office/word/2010/wordprocessingShape" mc:Ignorable="w14 w15 w16se w16cid w16 w16cex w16sdtdh w16sdtfl w16du wp14">
-  <w:comment w:id="0" w:author="Badhia Katz" w:date="2026-02-23T11:45:00Z" w:initials="BK">
-    <w:p>
-      <w:pPr>
-        <w:pStyle w:val="CommentText"/>
-      </w:pPr>
-      <w:r>
-        <w:rPr>
-          <w:rStyle w:val="CommentReference"/>
-        </w:rPr>
-        <w:annotationRef/>
-      </w:r>
-      <w:r>
-        <w:t>Have later years been modeled?</w:t>
-      </w:r>
-    </w:p>
-  </w:comment>
-</w:comments>
-</file>
-
-<file path=word/commentsExtended.xml><?xml version="1.0" encoding="utf-8"?>
-<w15:commentsEx xmlns:wpc="http://schemas.microsoft.com/office/word/2010/wordprocessingCanvas" xmlns:cx="http://schemas.microsoft.com/office/drawing/2014/chartex" xmlns:cx1="http://schemas.microsoft.com/office/drawing/2015/9/8/chartex" xmlns:cx2="http://schemas.microsoft.com/office/drawing/2015/10/21/chartex" xmlns:cx3="http://schemas.microsoft.com/office/drawing/2016/5/9/chartex" xmlns:cx4="http://schemas.microsoft.com/office/drawing/2016/5/10/chartex" xmlns:cx5="http://schemas.microsoft.com/office/drawing/2016/5/11/chartex" xmlns:cx6="http://schemas.microsoft.com/office/drawing/2016/5/12/chartex" xmlns:cx7="http://schemas.microsoft.com/office/drawing/2016/5/13/chartex" xmlns:cx8="http://schemas.microsoft.com/office/drawing/2016/5/14/chartex" xmlns:mc="http://schemas.openxmlformats.org/markup-compatibility/2006" xmlns:aink="http://schemas.microsoft.com/office/drawing/2016/ink" xmlns:am3d="http://schemas.microsoft.com/office/drawing/2017/model3d" xmlns:o="urn:schemas-microsoft-com:office:office" xmlns:oel="http://schemas.microsoft.com/office/2019/extlst" xmlns:r="http://schemas.openxmlformats.org/officeDocument/2006/relationships" xmlns:m="http://schemas.openxmlformats.org/officeDocument/2006/math" xmlns:v="urn:schemas-microsoft-com:vml" xmlns:wp14="http://schemas.microsoft.com/office/word/2010/wordprocessingDrawing" xmlns:wp="http://schemas.openxmlformats.org/drawingml/2006/wordprocessingDrawing" xmlns:w10="urn:schemas-microsoft-com:office:word" xmlns:w="http://schemas.openxmlformats.org/wordprocessingml/2006/main" xmlns:w14="http://schemas.microsoft.com/office/word/2010/wordml" xmlns:w15="http://schemas.microsoft.com/office/word/2012/wordml" xmlns:w16cex="http://schemas.microsoft.com/office/word/2018/wordml/cex" xmlns:w16cid="http://schemas.microsoft.com/office/word/2016/wordml/cid" xmlns:w16="http://schemas.microsoft.com/office/word/2018/wordml" xmlns:w16du="http://schemas.microsoft.com/office/word/2023/wordml/word16du" xmlns:w16sdtdh="http://schemas.microsoft.com/office/word/2020/wordml/sdtdatahash" xmlns:w16sdtfl="http://schemas.microsoft.com/office/word/2024/wordml/sdtformatlock" xmlns:w16se="http://schemas.microsoft.com/office/word/2015/wordml/symex" xmlns:wpg="http://schemas.microsoft.com/office/word/2010/wordprocessingGroup" xmlns:wpi="http://schemas.microsoft.com/office/word/2010/wordprocessingInk" xmlns:wne="http://schemas.microsoft.com/office/word/2006/wordml" xmlns:wps="http://schemas.microsoft.com/office/word/2010/wordprocessingShape" mc:Ignorable="w14 w15 w16se w16cid w16 w16cex w16sdtdh w16sdtfl w16du wp14">
-  <w15:commentEx w15:paraId="62ABDDB1" w15:done="0"/>
-</w15:commentsEx>
-</file>
-
-<file path=word/commentsExtensible.xml><?xml version="1.0" encoding="utf-8"?>
-<w16cex:commentsExtensible xmlns:wpc="http://schemas.microsoft.com/office/word/2010/wordprocessingCanvas" xmlns:cx="http://schemas.microsoft.com/office/drawing/2014/chartex" xmlns:cx1="http://schemas.microsoft.com/office/drawing/2015/9/8/chartex" xmlns:cx2="http://schemas.microsoft.com/office/drawing/2015/10/21/chartex" xmlns:cx3="http://schemas.microsoft.com/office/drawing/2016/5/9/chartex" xmlns:cx4="http://schemas.microsoft.com/office/drawing/2016/5/10/chartex" xmlns:cx5="http://schemas.microsoft.com/office/drawing/2016/5/11/chartex" xmlns:cx6="http://schemas.microsoft.com/office/drawing/2016/5/12/chartex" xmlns:cx7="http://schemas.microsoft.com/office/drawing/2016/5/13/chartex" xmlns:cx8="http://schemas.microsoft.com/office/drawing/2016/5/14/chartex" xmlns:cr="http://schemas.microsoft.com/office/comments/2020/reactions" xmlns:mc="http://schemas.openxmlformats.org/markup-compatibility/2006" xmlns:aink="http://schemas.microsoft.com/office/drawing/2016/ink" xmlns:am3d="http://schemas.microsoft.com/office/drawing/2017/model3d" xmlns:o="urn:schemas-microsoft-com:office:office" xmlns:oel="http://schemas.microsoft.com/office/2019/extlst" xmlns:r="http://schemas.openxmlformats.org/officeDocument/2006/relationships" xmlns:m="http://schemas.openxmlformats.org/officeDocument/2006/math" xmlns:v="urn:schemas-microsoft-com:vml" xmlns:wp14="http://schemas.microsoft.com/office/word/2010/wordprocessingDrawing" xmlns:wp="http://schemas.openxmlformats.org/drawingml/2006/wordprocessingDrawing" xmlns:w10="urn:schemas-microsoft-com:office:word" xmlns:w="http://schemas.openxmlformats.org/wordprocessingml/2006/main" xmlns:w14="http://schemas.microsoft.com/office/word/2010/wordml" xmlns:w15="http://schemas.microsoft.com/office/word/2012/wordml" xmlns:w16cex="http://schemas.microsoft.com/office/word/2018/wordml/cex" xmlns:w16cid="http://schemas.microsoft.com/office/word/2016/wordml/cid" xmlns:w16="http://schemas.microsoft.com/office/word/2018/wordml" xmlns:w16du="http://schemas.microsoft.com/office/word/2023/wordml/word16du" xmlns:w16sdtdh="http://schemas.microsoft.com/office/word/2020/wordml/sdtdatahash" xmlns:w16sdtfl="http://schemas.microsoft.com/office/word/2024/wordml/sdtformatlock" xmlns:w16se="http://schemas.microsoft.com/office/word/2015/wordml/symex" xmlns:wpg="http://schemas.microsoft.com/office/word/2010/wordprocessingGroup" xmlns:wpi="http://schemas.microsoft.com/office/word/2010/wordprocessingInk" xmlns:wne="http://schemas.microsoft.com/office/word/2006/wordml" xmlns:wps="http://schemas.microsoft.com/office/word/2010/wordprocessingShape" mc:Ignorable="w14 w15 w16se w16cid w16 w16cex w16sdtdh w16sdtfl cr w16du wp14">
-  <w16cex:commentExtensible w16cex:durableId="5BCB5155" w16cex:dateUtc="2026-02-23T19:45:00Z"/>
-</w16cex:commentsExtensible>
-</file>
-
-<file path=word/commentsIds.xml><?xml version="1.0" encoding="utf-8"?>
-<w16cid:commentsIds xmlns:wpc="http://schemas.microsoft.com/office/word/2010/wordprocessingCanvas" xmlns:cx="http://schemas.microsoft.com/office/drawing/2014/chartex" xmlns:cx1="http://schemas.microsoft.com/office/drawing/2015/9/8/chartex" xmlns:cx2="http://schemas.microsoft.com/office/drawing/2015/10/21/chartex" xmlns:cx3="http://schemas.microsoft.com/office/drawing/2016/5/9/chartex" xmlns:cx4="http://schemas.microsoft.com/office/drawing/2016/5/10/chartex" xmlns:cx5="http://schemas.microsoft.com/office/drawing/2016/5/11/chartex" xmlns:cx6="http://schemas.microsoft.com/office/drawing/2016/5/12/chartex" xmlns:cx7="http://schemas.microsoft.com/office/drawing/2016/5/13/chartex" xmlns:cx8="http://schemas.microsoft.com/office/drawing/2016/5/14/chartex" xmlns:mc="http://schemas.openxmlformats.org/markup-compatibility/2006" xmlns:aink="http://schemas.microsoft.com/office/drawing/2016/ink" xmlns:am3d="http://schemas.microsoft.com/office/drawing/2017/model3d" xmlns:o="urn:schemas-microsoft-com:office:office" xmlns:oel="http://schemas.microsoft.com/office/2019/extlst" xmlns:r="http://schemas.openxmlformats.org/officeDocument/2006/relationships" xmlns:m="http://schemas.openxmlformats.org/officeDocument/2006/math" xmlns:v="urn:schemas-microsoft-com:vml" xmlns:wp14="http://schemas.microsoft.com/office/word/2010/wordprocessingDrawing" xmlns:wp="http://schemas.openxmlformats.org/drawingml/2006/wordprocessingDrawing" xmlns:w10="urn:schemas-microsoft-com:office:word" xmlns:w="http://schemas.openxmlformats.org/wordprocessingml/2006/main" xmlns:w14="http://schemas.microsoft.com/office/word/2010/wordml" xmlns:w15="http://schemas.microsoft.com/office/word/2012/wordml" xmlns:w16cex="http://schemas.microsoft.com/office/word/2018/wordml/cex" xmlns:w16cid="http://schemas.microsoft.com/office/word/2016/wordml/cid" xmlns:w16="http://schemas.microsoft.com/office/word/2018/wordml" xmlns:w16du="http://schemas.microsoft.com/office/word/2023/wordml/word16du" xmlns:w16sdtdh="http://schemas.microsoft.com/office/word/2020/wordml/sdtdatahash" xmlns:w16sdtfl="http://schemas.microsoft.com/office/word/2024/wordml/sdtformatlock" xmlns:w16se="http://schemas.microsoft.com/office/word/2015/wordml/symex" xmlns:wpg="http://schemas.microsoft.com/office/word/2010/wordprocessingGroup" xmlns:wpi="http://schemas.microsoft.com/office/word/2010/wordprocessingInk" xmlns:wne="http://schemas.microsoft.com/office/word/2006/wordml" xmlns:wps="http://schemas.microsoft.com/office/word/2010/wordprocessingShape" mc:Ignorable="w14 w15 w16se w16cid w16 w16cex w16sdtdh w16sdtfl w16du wp14">
-  <w16cid:commentId w16cid:paraId="62ABDDB1" w16cid:durableId="5BCB5155"/>
-</w16cid:commentsIds>
 </file>
 
 <file path=word/numbering.xml><?xml version="1.0" encoding="utf-8"?>
@@ -1816,14 +1946,6 @@
     <w:abstractNumId w:val="0"/>
   </w:num>
 </w:numbering>
-</file>
-
-<file path=word/people.xml><?xml version="1.0" encoding="utf-8"?>
-<w15:people xmlns:wpc="http://schemas.microsoft.com/office/word/2010/wordprocessingCanvas" xmlns:cx="http://schemas.microsoft.com/office/drawing/2014/chartex" xmlns:cx1="http://schemas.microsoft.com/office/drawing/2015/9/8/chartex" xmlns:cx2="http://schemas.microsoft.com/office/drawing/2015/10/21/chartex" xmlns:cx3="http://schemas.microsoft.com/office/drawing/2016/5/9/chartex" xmlns:cx4="http://schemas.microsoft.com/office/drawing/2016/5/10/chartex" xmlns:cx5="http://schemas.microsoft.com/office/drawing/2016/5/11/chartex" xmlns:cx6="http://schemas.microsoft.com/office/drawing/2016/5/12/chartex" xmlns:cx7="http://schemas.microsoft.com/office/drawing/2016/5/13/chartex" xmlns:cx8="http://schemas.microsoft.com/office/drawing/2016/5/14/chartex" xmlns:mc="http://schemas.openxmlformats.org/markup-compatibility/2006" xmlns:aink="http://schemas.microsoft.com/office/drawing/2016/ink" xmlns:am3d="http://schemas.microsoft.com/office/drawing/2017/model3d" xmlns:o="urn:schemas-microsoft-com:office:office" xmlns:oel="http://schemas.microsoft.com/office/2019/extlst" xmlns:r="http://schemas.openxmlformats.org/officeDocument/2006/relationships" xmlns:m="http://schemas.openxmlformats.org/officeDocument/2006/math" xmlns:v="urn:schemas-microsoft-com:vml" xmlns:wp14="http://schemas.microsoft.com/office/word/2010/wordprocessingDrawing" xmlns:wp="http://schemas.openxmlformats.org/drawingml/2006/wordprocessingDrawing" xmlns:w10="urn:schemas-microsoft-com:office:word" xmlns:w="http://schemas.openxmlformats.org/wordprocessingml/2006/main" xmlns:w14="http://schemas.microsoft.com/office/word/2010/wordml" xmlns:w15="http://schemas.microsoft.com/office/word/2012/wordml" xmlns:w16cex="http://schemas.microsoft.com/office/word/2018/wordml/cex" xmlns:w16cid="http://schemas.microsoft.com/office/word/2016/wordml/cid" xmlns:w16="http://schemas.microsoft.com/office/word/2018/wordml" xmlns:w16du="http://schemas.microsoft.com/office/word/2023/wordml/word16du" xmlns:w16sdtdh="http://schemas.microsoft.com/office/word/2020/wordml/sdtdatahash" xmlns:w16sdtfl="http://schemas.microsoft.com/office/word/2024/wordml/sdtformatlock" xmlns:w16se="http://schemas.microsoft.com/office/word/2015/wordml/symex" xmlns:wpg="http://schemas.microsoft.com/office/word/2010/wordprocessingGroup" xmlns:wpi="http://schemas.microsoft.com/office/word/2010/wordprocessingInk" xmlns:wne="http://schemas.microsoft.com/office/word/2006/wordml" xmlns:wps="http://schemas.microsoft.com/office/word/2010/wordprocessingShape" mc:Ignorable="w14 w15 w16se w16cid w16 w16cex w16sdtdh w16sdtfl w16du wp14">
-  <w15:person w15:author="Badhia Katz">
-    <w15:presenceInfo w15:providerId="AD" w15:userId="S::byuneskatz@flowwest.com::1ca58973-5ad0-4cbc-bc5d-615e27437c92"/>
-  </w15:person>
-</w15:people>
 </file>
 
 <file path=word/styles.xml><?xml version="1.0" encoding="utf-8"?>

</xml_diff>